<commit_message>
Give Joe fresh dialogue and animate the horizon
</commit_message>
<xml_diff>
--- a/docs/Rough_Cut_Game_Blueprint.docx
+++ b/docs/Rough_Cut_Game_Blueprint.docx
@@ -49,7 +49,7 @@
           <w:color w:val="5C3A2E"/>
           <w:sz w:val="30"/>
         </w:rPr>
-        <w:t>A JOE MOWER HORROR GAME</w:t>
+        <w:t>A JOE HORROR GAME</w:t>
       </w:r>
     </w:p>
     <w:p>
@@ -5921,7 +5921,7 @@
           <w:color w:val="202623"/>
           <w:sz w:val="20"/>
         </w:rPr>
-        <w:t>Rough Cut: A Joe Mower Horror Game. The name connects tall grass, mower blades, a violent threat, and the product-owner idea of an unfinished release. It is short, distinctive, and supports both dread and dry comedy.</w:t>
+        <w:t>Rough Cut: A Joe Horror Game. The name keeps Joe at the center while the title connects tall grass, mower blades, a violent threat, and the product-owner idea of an unfinished release. It is short, distinctive, and supports both dread and dry comedy.</w:t>
       </w:r>
     </w:p>
     <w:tbl>

</xml_diff>

<commit_message>
Deepen the living course and delivery loop
</commit_message>
<xml_diff>
--- a/docs/Rough_Cut_Game_Blueprint.docx
+++ b/docs/Rough_Cut_Game_Blueprint.docx
@@ -163,7 +163,7 @@
           <w:color w:val="202623"/>
           <w:sz w:val="20"/>
         </w:rPr>
-        <w:t>After an insurance-company golf outing becomes Joe's unauthorized 'course optimization pilot,' a stranded coworker must cross nine increasingly hostile holes while the product owner—obsessed with grass, golf, and measurable outcomes—mows away hiding places and treats the player as an uncontrolled risk.</w:t>
+        <w:t>After an insurance-company golf outing becomes Joe's unauthorized 'course optimization pilot,' a stranded coworker must cross nine increasingly hostile holes while the software Product Owner—obsessed with grass, golf, and measurable outcomes—mows away hiding places and treats the player as unplanned scope.</w:t>
       </w:r>
     </w:p>
     <w:tbl>
@@ -564,7 +564,7 @@
                 <w:color w:val="202623"/>
                 <w:sz w:val="18"/>
               </w:rPr>
-              <w:t>Joe, an insurance product owner whose grass-and-golf obsession turns backlog discipline, risk language, and a lawn mower into a terrifying pursuit system.</w:t>
+              <w:t>Joe, a software Product Owner employed by an insurance company—not an adjuster—whose grass-and-golf obsession turns backlog ownership, sprint goals, acceptance criteria, and a lawn mower into a terrifying pursuit system.</w:t>
             </w:r>
           </w:p>
         </w:tc>
@@ -793,6 +793,23 @@
       </w:r>
     </w:p>
     <w:p>
+      <w:r>
+        <w:rPr>
+          <w:rFonts w:ascii="Calibri" w:hAnsi="Calibri"/>
+          <w:b/>
+          <w:color w:val="202623"/>
+        </w:rPr>
+        <w:t>Mastery compounds.</w:t>
+      </w:r>
+      <w:r>
+        <w:rPr>
+          <w:rFonts w:ascii="Calibri" w:hAnsi="Calibri"/>
+          <w:color w:val="202623"/>
+        </w:rPr>
+        <w:t xml:space="preserve"> Recoveries, bait plays, progress, and clean contact breaks can be linked into a short Delivery Chain that rewards expressive play without reducing danger.</w:t>
+      </w:r>
+    </w:p>
+    <w:p>
       <w:pPr>
         <w:pStyle w:val="Heading1"/>
         <w:keepNext/>
@@ -946,6 +963,18 @@
           <w:color w:val="202623"/>
         </w:rPr>
         <w:t>Redirect or evade Joe as he permanently changes the route.</w:t>
+      </w:r>
+    </w:p>
+    <w:p>
+      <w:pPr>
+        <w:pStyle w:val="ListNumber"/>
+      </w:pPr>
+      <w:r>
+        <w:rPr>
+          <w:rFonts w:ascii="Calibri" w:hAnsi="Calibri"/>
+          <w:color w:val="202623"/>
+        </w:rPr>
+        <w:t>Link smart plays inside the Delivery Chain window for optional score mastery.</w:t>
       </w:r>
     </w:p>
     <w:p>
@@ -3193,7 +3222,7 @@
           <w:rFonts w:ascii="Calibri" w:hAnsi="Calibri"/>
           <w:color w:val="202623"/>
         </w:rPr>
-        <w:t>Joe never acknowledges that the situation is funny. Humor comes from his absolute sincerity, insurance and product-management language applied to mortal danger, course etiquette, machinery, and the player's desperate use of ordinary golf equipment.</w:t>
+        <w:t>Joe never acknowledges that the situation is funny. Humor comes from his absolute sincerity: software-product, Agile, Scrum, and delivery language applied to mortal danger, course etiquette, machinery, and the player's desperate use of ordinary golf equipment. Insurance is his industry context, not his profession.</w:t>
       </w:r>
     </w:p>
     <w:p>
@@ -3229,7 +3258,7 @@
           <w:rFonts w:ascii="Calibri" w:hAnsi="Calibri"/>
           <w:color w:val="202623"/>
         </w:rPr>
-        <w:t>A failure screen reads, 'COVERAGE DENIED: unauthorized presence in the rough.'</w:t>
+        <w:t>A failure screen reads, 'SPRINT TERMINATED: failed Joe's acceptance review.'</w:t>
       </w:r>
     </w:p>
     <w:p>
@@ -3271,7 +3300,7 @@
           <w:rFonts w:ascii="Calibri" w:hAnsi="Calibri"/>
           <w:color w:val="202623"/>
         </w:rPr>
-        <w:t>Joe is a product owner at an insurance company. At work he translates ambiguity into prioritized backlogs, acceptance criteria, risk registers, and measurable outcomes. Away from work he applies that same intensity to grass and golf: mowing patterns are roadmaps, divots are defects, and an imperfect fairway is an unresolved incident.</w:t>
+        <w:t>Joe is a software Product Owner employed by an insurance company. He is not an adjuster, does not investigate losses, and does not decide claims. He owns value, ordering, and clarity for an internal software backlog: translating stakeholder ambiguity into product goals, prioritized user stories, acceptance criteria, release increments, dependency decisions, and measurable outcomes. Away from work he applies that same intensity to grass and golf: mowing patterns are roadmaps, divots are defects, bunkers are blockers, weather is a dependency, and an imperfect fairway is an increment that cannot be accepted.</w:t>
       </w:r>
     </w:p>
     <w:p>
@@ -3283,7 +3312,7 @@
           <w:rFonts w:ascii="Calibri" w:hAnsi="Calibri"/>
           <w:color w:val="202623"/>
         </w:rPr>
-        <w:t>Joe persuaded the company to sponsor an after-hours golf outing and a supposedly harmless 'course optimization pilot.'</w:t>
+        <w:t>Joe began in the insurer's software division by owning a policy-platform roadmap. He became valued for ruthless backlog clarity, calm stakeholder alignment, and an unnerving ability to turn vague requests into testable outcomes.</w:t>
       </w:r>
     </w:p>
     <w:p>
@@ -3295,7 +3324,7 @@
           <w:rFonts w:ascii="Calibri" w:hAnsi="Calibri"/>
           <w:color w:val="202623"/>
         </w:rPr>
-        <w:t>When the course fails his standards, Joe refuses to end the work. He commandeers a mower and the maintenance controls to complete the plan before morning.</w:t>
+        <w:t>He persuaded facilities, workplace technology, and leadership to sponsor an after-hours golf outing around a supposedly harmless 'course optimization pilot'—a sensor-and-operations product experiment measuring turf consistency, pace of play, and employee engagement.</w:t>
       </w:r>
     </w:p>
     <w:p>
@@ -3307,7 +3336,7 @@
           <w:rFonts w:ascii="Calibri" w:hAnsi="Calibri"/>
           <w:color w:val="202623"/>
         </w:rPr>
-        <w:t>The player is a coworker left behind when the gates lock. To Joe, they are no longer a colleague; they are an uncontrolled exposure producing unauthorized variance.</w:t>
+        <w:t>When the pilot produces irregular data and the course fails his standards, Joe refuses to close the increment. He commandeers a mower and the maintenance controls to complete the sprint goal before morning.</w:t>
       </w:r>
     </w:p>
     <w:p>
@@ -3319,7 +3348,43 @@
           <w:rFonts w:ascii="Calibri" w:hAnsi="Calibri"/>
           <w:color w:val="202623"/>
         </w:rPr>
-        <w:t>Joe's product-owner habits make him frighteningly methodical beneath his erratic movements: he observes, prioritizes, tests, and removes obstacles.</w:t>
+        <w:t>The player is a coworker left behind when the gates lock. To Joe, they are no longer a colleague; they are unplanned scope, an unmanaged dependency, and the last blocker between him and release acceptance.</w:t>
+      </w:r>
+    </w:p>
+    <w:p>
+      <w:pPr>
+        <w:pStyle w:val="ListBullet"/>
+      </w:pPr>
+      <w:r>
+        <w:rPr>
+          <w:rFonts w:ascii="Calibri" w:hAnsi="Calibri"/>
+          <w:color w:val="202623"/>
+        </w:rPr>
+        <w:t>Joe's Product Owner habits make him frighteningly methodical beneath his erratic movements: he observes behavior, reorders priorities, tests hypotheses, clarifies acceptance criteria, and removes blockers.</w:t>
+      </w:r>
+    </w:p>
+    <w:p>
+      <w:pPr>
+        <w:pStyle w:val="ListBullet"/>
+      </w:pPr>
+      <w:r>
+        <w:rPr>
+          <w:rFonts w:ascii="Calibri" w:hAnsi="Calibri"/>
+          <w:color w:val="202623"/>
+        </w:rPr>
+        <w:t>His mower stripes are a physical roadmap. Each cut lane is an accepted increment; each patch of rough is technical debt; every footprint is a defect report; every hiding place is a dependency he has not resolved.</w:t>
+      </w:r>
+    </w:p>
+    <w:p>
+      <w:pPr>
+        <w:pStyle w:val="ListBullet"/>
+      </w:pPr>
+      <w:r>
+        <w:rPr>
+          <w:rFonts w:ascii="Calibri" w:hAnsi="Calibri"/>
+          <w:color w:val="202623"/>
+        </w:rPr>
+        <w:t>Joe sincerely believes he is maximizing value for the course, the company, and every stakeholder. The horror deepens because he never sees himself as angry or cruel—only accountable for the product outcome.</w:t>
       </w:r>
     </w:p>
     <w:p>
@@ -4600,6 +4665,18 @@
           <w:rFonts w:ascii="Calibri" w:hAnsi="Calibri"/>
           <w:color w:val="202623"/>
         </w:rPr>
+        <w:t>A 14-second Delivery Chain that scores linked progress, ball recoveries, bunker baits, optional Change Requests, and contact breaks without modifying survival difficulty.</w:t>
+      </w:r>
+    </w:p>
+    <w:p>
+      <w:pPr>
+        <w:pStyle w:val="ListBullet"/>
+      </w:pPr>
+      <w:r>
+        <w:rPr>
+          <w:rFonts w:ascii="Calibri" w:hAnsi="Calibri"/>
+          <w:color w:val="202623"/>
+        </w:rPr>
         <w:t>Persistent grass removal and one opened maintenance shortcut.</w:t>
       </w:r>
     </w:p>
@@ -4799,6 +4876,18 @@
           <w:color w:val="202623"/>
         </w:rPr>
         <w:t>The optional golf shot creates a meaningful risk rather than a detached minigame.</w:t>
+      </w:r>
+    </w:p>
+    <w:p>
+      <w:pPr>
+        <w:pStyle w:val="ListBullet"/>
+      </w:pPr>
+      <w:r>
+        <w:rPr>
+          <w:rFonts w:ascii="Calibri" w:hAnsi="Calibri"/>
+          <w:color w:val="202623"/>
+        </w:rPr>
+        <w:t>A player can explain what extended or ended a Delivery Chain and can ignore it without losing access to either exit.</w:t>
       </w:r>
     </w:p>
     <w:p>

</xml_diff>